<commit_message>
Draft_090 (in place): unify 3 empties before ALL major headers (Option A); line spacing confirmed 2.0 in main body
</commit_message>
<xml_diff>
--- a/thesis/003_ThesisProposal_Draft_090.docx
+++ b/thesis/003_ThesisProposal_Draft_090.docx
@@ -281,6 +281,9 @@
         <w:t xml:space="preserve">October 2026</w:t>
       </w:r>
     </w:p>
+    <w:p/>
+    <w:p/>
+    <w:p/>
     <w:p>
       <w:pPr>
         <w:spacing w:before="720" w:after="720" w:line="480" w:lineRule="auto"/>
@@ -2183,6 +2186,9 @@
         </w:rPr>
       </w:r>
     </w:p>
+    <w:p/>
+    <w:p/>
+    <w:p/>
     <w:p>
       <w:pPr>
         <w:spacing w:before="720" w:after="720" w:line="480" w:lineRule="auto"/>
@@ -4029,6 +4035,9 @@
         <w:t>Abstracts were accessed on-site at the PSAU Library with proper authorization. Student names were fully anonymized using discipline codes (Acs1–Acs10, Aas1–Aas10, VM1–VM20, B1–B20) before analysis began. Thesis titles that appear as quoted wording inside an abstract (source text) were redacted in the coded appendix where they identified the work. Residual title fragments, if any, do not include student names. The study analyzed linguistic patterns in text, not student performance or personal information. All data files were stored on password-protected devices and encrypted cloud storage accessible only to the researcher and thesis adviser. These files are retained for five years to support verification of coding decisions by future researchers and to allow for follow-up comparative studies, after which they are permanently deleted in line with standard academic data retention practice.</w:t>
       </w:r>
     </w:p>
+    <w:p/>
+    <w:p/>
+    <w:p/>
     <w:p>
       <w:pPr>
         <w:spacing w:before="720" w:after="720" w:line="480" w:lineRule="auto"/>
@@ -11130,28 +11139,9 @@
         <w:t xml:space="preserve">The study cannot separate genuine field norms from adviser-enforced conventions. The findings describe the ratified abstracts, not individual cognition. Read as a local baseline, the corpus supports a limited claim: among these three PSAU programs, the only pairwise density contrast that survives correction is Biology versus Veterinary Medicine, and that contrast is not reducible to outcome type in the Binary cell comparison above. Whether that pattern reflects program practice, adviser feedback, or other institutional factors cannot be decided from abstract text alone; the present study maps the textual result, not its causes.</w:t>
       </w:r>
     </w:p>
-    <w:p>
-      <w:pPr>
-        <w:spacing w:before="0" w:after="0" w:line="480" w:lineRule="auto"/>
-        <w:ind w:firstLine="720"/>
-        <w:jc w:val="both"/>
-        <w:rPr/>
-      </w:pPr>
-      <w:r>
-        <w:rPr>
-          <w:rtl w:val="0"/>
-        </w:rPr>
-        <w:t/>
-      </w:r>
-    </w:p>
-    <w:p>
-      <w:pPr>
-        <w:spacing w:before="0" w:after="0" w:line="240" w:lineRule="auto"/>
-      </w:pPr>
-      <w:r>
-        <w:br w:type="page"/>
-      </w:r>
-    </w:p>
+    <w:p/>
+    <w:p/>
+    <w:p/>
     <w:p>
       <w:pPr>
         <w:spacing w:before="720" w:after="720" w:line="480" w:lineRule="auto"/>
@@ -11426,14 +11416,9 @@
         </w:rPr>
       </w:r>
     </w:p>
-    <w:p>
-      <w:pPr>
-        <w:spacing w:before="0" w:after="0" w:line="240" w:lineRule="auto"/>
-      </w:pPr>
-      <w:r>
-        <w:br w:type="page"/>
-      </w:r>
-    </w:p>
+    <w:p/>
+    <w:p/>
+    <w:p/>
     <w:p>
       <w:pPr>
         <w:spacing w:before="720" w:after="720" w:line="480" w:lineRule="auto"/>
@@ -12375,6 +12360,9 @@
         <w:t>(2), 249–265. https://doi.org/10.1002/leap.1515</w:t>
       </w:r>
     </w:p>
+    <w:p/>
+    <w:p/>
+    <w:p/>
     <w:p>
       <w:pPr>
         <w:keepNext w:val="1"/>
@@ -12404,6 +12392,9 @@
         </w:rPr>
       </w:r>
     </w:p>
+    <w:p/>
+    <w:p/>
+    <w:p/>
     <w:p>
       <w:pPr>
         <w:spacing w:before="40" w:after="20" w:line="264" w:lineRule="auto"/>
@@ -19866,6 +19857,9 @@
         </w:rPr>
       </w:r>
     </w:p>
+    <w:p/>
+    <w:p/>
+    <w:p/>
     <w:p>
       <w:pPr>
         <w:spacing w:before="120" w:after="0" w:line="456" w:lineRule="auto"/>
@@ -20718,6 +20712,9 @@
         </w:rPr>
       </w:r>
     </w:p>
+    <w:p/>
+    <w:p/>
+    <w:p/>
     <w:p>
       <w:pPr>
         <w:keepNext w:val="1"/>

</xml_diff>

<commit_message>
Draft_090 (in place): fix spacing before major headers — remove pageBreakBefore from CONCLUSIONS/REFERENCES/APPENDICES/APPENDIX_C; add explicit page breaks so 3 empties render on header's page; verify gaps now ~1.88in (3 empties + 0.5in spacing)
</commit_message>
<xml_diff>
--- a/thesis/003_ThesisProposal_Draft_090.docx
+++ b/thesis/003_ThesisProposal_Draft_090.docx
@@ -11139,7 +11139,11 @@
         <w:t xml:space="preserve">The study cannot separate genuine field norms from adviser-enforced conventions. The findings describe the ratified abstracts, not individual cognition. Read as a local baseline, the corpus supports a limited claim: among these three PSAU programs, the only pairwise density contrast that survives correction is Biology versus Veterinary Medicine, and that contrast is not reducible to outcome type in the Binary cell comparison above. Whether that pattern reflects program practice, adviser feedback, or other institutional factors cannot be decided from abstract text alone; the present study maps the textual result, not its causes.</w:t>
       </w:r>
     </w:p>
-    <w:p/>
+    <w:p>
+      <w:r>
+        <w:br w:type="page"/>
+      </w:r>
+    </w:p>
     <w:p/>
     <w:p/>
     <w:p>
@@ -11416,7 +11420,11 @@
         </w:rPr>
       </w:r>
     </w:p>
-    <w:p/>
+    <w:p>
+      <w:r>
+        <w:br w:type="page"/>
+      </w:r>
+    </w:p>
     <w:p/>
     <w:p/>
     <w:p>
@@ -12360,7 +12368,11 @@
         <w:t>(2), 249–265. https://doi.org/10.1002/leap.1515</w:t>
       </w:r>
     </w:p>
-    <w:p/>
+    <w:p>
+      <w:r>
+        <w:br w:type="page"/>
+      </w:r>
+    </w:p>
     <w:p/>
     <w:p/>
     <w:p>
@@ -12369,7 +12381,6 @@
         <w:spacing w:before="240" w:after="240" w:line="240" w:lineRule="auto"/>
         <w:jc w:val="center"/>
         <w:rPr/>
-        <w:pageBreakBefore w:val="1"/>
       </w:pPr>
       <w:r>
         <w:rPr>
@@ -20718,10 +20729,9 @@
     <w:p>
       <w:pPr>
         <w:keepNext w:val="1"/>
-        <w:spacing w:before="240" w:after="0" w:line="480" w:lineRule="auto"/>
+        <w:spacing w:before="720" w:after="0" w:line="480" w:lineRule="auto"/>
         <w:jc w:val="center"/>
         <w:rPr/>
-        <w:pageBreakBefore/>
       </w:pPr>
       <w:r>
         <w:rPr>

</xml_diff>

<commit_message>
Draft_090 (in place): remove all empty paragraphs before major headers — was stacking 3 empties ON TOP of before=720 paragraph spacing (double-spacing). Now only before=720 (0.5") spacing remains. Gap ~0.52" consistent across all headers.
</commit_message>
<xml_diff>
--- a/thesis/003_ThesisProposal_Draft_090.docx
+++ b/thesis/003_ThesisProposal_Draft_090.docx
@@ -281,9 +281,6 @@
         <w:t xml:space="preserve">October 2026</w:t>
       </w:r>
     </w:p>
-    <w:p/>
-    <w:p/>
-    <w:p/>
     <w:p>
       <w:pPr>
         <w:spacing w:before="720" w:after="720" w:line="480" w:lineRule="auto"/>
@@ -2186,9 +2183,6 @@
         </w:rPr>
       </w:r>
     </w:p>
-    <w:p/>
-    <w:p/>
-    <w:p/>
     <w:p>
       <w:pPr>
         <w:spacing w:before="720" w:after="720" w:line="480" w:lineRule="auto"/>
@@ -4035,9 +4029,6 @@
         <w:t>Abstracts were accessed on-site at the PSAU Library with proper authorization. Student names were fully anonymized using discipline codes (Acs1–Acs10, Aas1–Aas10, VM1–VM20, B1–B20) before analysis began. Thesis titles that appear as quoted wording inside an abstract (source text) were redacted in the coded appendix where they identified the work. Residual title fragments, if any, do not include student names. The study analyzed linguistic patterns in text, not student performance or personal information. All data files were stored on password-protected devices and encrypted cloud storage accessible only to the researcher and thesis adviser. These files are retained for five years to support verification of coding decisions by future researchers and to allow for follow-up comparative studies, after which they are permanently deleted in line with standard academic data retention practice.</w:t>
       </w:r>
     </w:p>
-    <w:p/>
-    <w:p/>
-    <w:p/>
     <w:p>
       <w:pPr>
         <w:spacing w:before="720" w:after="720" w:line="480" w:lineRule="auto"/>
@@ -11140,13 +11131,6 @@
       </w:r>
     </w:p>
     <w:p>
-      <w:r>
-        <w:br w:type="page"/>
-      </w:r>
-    </w:p>
-    <w:p/>
-    <w:p/>
-    <w:p>
       <w:pPr>
         <w:spacing w:before="720" w:after="720" w:line="480" w:lineRule="auto"/>
         <w:jc w:val="center"/>
@@ -11421,13 +11405,6 @@
       </w:r>
     </w:p>
     <w:p>
-      <w:r>
-        <w:br w:type="page"/>
-      </w:r>
-    </w:p>
-    <w:p/>
-    <w:p/>
-    <w:p>
       <w:pPr>
         <w:spacing w:before="720" w:after="720" w:line="480" w:lineRule="auto"/>
         <w:jc w:val="center"/>
@@ -12369,13 +12346,6 @@
       </w:r>
     </w:p>
     <w:p>
-      <w:r>
-        <w:br w:type="page"/>
-      </w:r>
-    </w:p>
-    <w:p/>
-    <w:p/>
-    <w:p>
       <w:pPr>
         <w:keepNext w:val="1"/>
         <w:spacing w:before="240" w:after="240" w:line="240" w:lineRule="auto"/>
@@ -12403,9 +12373,6 @@
         </w:rPr>
       </w:r>
     </w:p>
-    <w:p/>
-    <w:p/>
-    <w:p/>
     <w:p>
       <w:pPr>
         <w:spacing w:before="40" w:after="20" w:line="264" w:lineRule="auto"/>
@@ -19868,9 +19835,6 @@
         </w:rPr>
       </w:r>
     </w:p>
-    <w:p/>
-    <w:p/>
-    <w:p/>
     <w:p>
       <w:pPr>
         <w:spacing w:before="120" w:after="0" w:line="456" w:lineRule="auto"/>
@@ -20723,9 +20687,6 @@
         </w:rPr>
       </w:r>
     </w:p>
-    <w:p/>
-    <w:p/>
-    <w:p/>
     <w:p>
       <w:pPr>
         <w:keepNext w:val="1"/>

</xml_diff>

<commit_message>
Draft_090 (in place): restore overwritten properties — APPENDICES pageBreakBefore=True, CONCLUSIONS 2 empties, REFERENCES 1 empty (matching original Draft_089)
</commit_message>
<xml_diff>
--- a/thesis/003_ThesisProposal_Draft_090.docx
+++ b/thesis/003_ThesisProposal_Draft_090.docx
@@ -11130,6 +11130,8 @@
         <w:t xml:space="preserve">The study cannot separate genuine field norms from adviser-enforced conventions. The findings describe the ratified abstracts, not individual cognition. Read as a local baseline, the corpus supports a limited claim: among these three PSAU programs, the only pairwise density contrast that survives correction is Biology versus Veterinary Medicine, and that contrast is not reducible to outcome type in the Binary cell comparison above. Whether that pattern reflects program practice, adviser feedback, or other institutional factors cannot be decided from abstract text alone; the present study maps the textual result, not its causes.</w:t>
       </w:r>
     </w:p>
+    <w:p/>
+    <w:p/>
     <w:p>
       <w:pPr>
         <w:spacing w:before="720" w:after="720" w:line="480" w:lineRule="auto"/>
@@ -11404,6 +11406,7 @@
         </w:rPr>
       </w:r>
     </w:p>
+    <w:p/>
     <w:p>
       <w:pPr>
         <w:spacing w:before="720" w:after="720" w:line="480" w:lineRule="auto"/>
@@ -12351,6 +12354,7 @@
         <w:spacing w:before="240" w:after="240" w:line="240" w:lineRule="auto"/>
         <w:jc w:val="center"/>
         <w:rPr/>
+        <w:pageBreakBefore/>
       </w:pPr>
       <w:r>
         <w:rPr>

</xml_diff>

<commit_message>
Draft_090 (in place): fix spacing inconsistency — APPENDICES/APPENDIX B/APPENDIX C now before=720 after=720 line=480 (matching INTRO-REFERENCES); APPENDIX A kept compact (one-page lookup exception)
</commit_message>
<xml_diff>
--- a/thesis/003_ThesisProposal_Draft_090.docx
+++ b/thesis/003_ThesisProposal_Draft_090.docx
@@ -12351,7 +12351,7 @@
     <w:p>
       <w:pPr>
         <w:keepNext w:val="1"/>
-        <w:spacing w:before="240" w:after="240" w:line="240" w:lineRule="auto"/>
+        <w:spacing w:before="720" w:after="720" w:line="480" w:lineRule="auto"/>
         <w:jc w:val="center"/>
         <w:rPr/>
         <w:pageBreakBefore/>
@@ -19841,7 +19841,7 @@
     </w:p>
     <w:p>
       <w:pPr>
-        <w:spacing w:before="120" w:after="0" w:line="456" w:lineRule="auto"/>
+        <w:spacing w:before="720" w:after="720" w:line="480" w:lineRule="auto"/>
         <w:jc w:val="center"/>
         <w:rPr/>
       </w:pPr>
@@ -20694,7 +20694,7 @@
     <w:p>
       <w:pPr>
         <w:keepNext w:val="1"/>
-        <w:spacing w:before="720" w:after="0" w:line="480" w:lineRule="auto"/>
+        <w:spacing w:before="720" w:after="720" w:line="480" w:lineRule="auto"/>
         <w:jc w:val="center"/>
         <w:rPr/>
       </w:pPr>

</xml_diff>

<commit_message>
Draft_090: revert to commit f2d0a16 (2nd commit after Figure 1 resize) — 115 pages, restores spacing state before empty-paragraph removal
</commit_message>
<xml_diff>
--- a/thesis/003_ThesisProposal_Draft_090.docx
+++ b/thesis/003_ThesisProposal_Draft_090.docx
@@ -281,6 +281,9 @@
         <w:t xml:space="preserve">October 2026</w:t>
       </w:r>
     </w:p>
+    <w:p/>
+    <w:p/>
+    <w:p/>
     <w:p>
       <w:pPr>
         <w:spacing w:before="720" w:after="720" w:line="480" w:lineRule="auto"/>
@@ -2183,6 +2186,9 @@
         </w:rPr>
       </w:r>
     </w:p>
+    <w:p/>
+    <w:p/>
+    <w:p/>
     <w:p>
       <w:pPr>
         <w:spacing w:before="720" w:after="720" w:line="480" w:lineRule="auto"/>
@@ -4029,6 +4035,9 @@
         <w:t>Abstracts were accessed on-site at the PSAU Library with proper authorization. Student names were fully anonymized using discipline codes (Acs1–Acs10, Aas1–Aas10, VM1–VM20, B1–B20) before analysis began. Thesis titles that appear as quoted wording inside an abstract (source text) were redacted in the coded appendix where they identified the work. Residual title fragments, if any, do not include student names. The study analyzed linguistic patterns in text, not student performance or personal information. All data files were stored on password-protected devices and encrypted cloud storage accessible only to the researcher and thesis adviser. These files are retained for five years to support verification of coding decisions by future researchers and to allow for follow-up comparative studies, after which they are permanently deleted in line with standard academic data retention practice.</w:t>
       </w:r>
     </w:p>
+    <w:p/>
+    <w:p/>
+    <w:p/>
     <w:p>
       <w:pPr>
         <w:spacing w:before="720" w:after="720" w:line="480" w:lineRule="auto"/>
@@ -11130,6 +11139,11 @@
         <w:t xml:space="preserve">The study cannot separate genuine field norms from adviser-enforced conventions. The findings describe the ratified abstracts, not individual cognition. Read as a local baseline, the corpus supports a limited claim: among these three PSAU programs, the only pairwise density contrast that survives correction is Biology versus Veterinary Medicine, and that contrast is not reducible to outcome type in the Binary cell comparison above. Whether that pattern reflects program practice, adviser feedback, or other institutional factors cannot be decided from abstract text alone; the present study maps the textual result, not its causes.</w:t>
       </w:r>
     </w:p>
+    <w:p>
+      <w:r>
+        <w:br w:type="page"/>
+      </w:r>
+    </w:p>
     <w:p/>
     <w:p/>
     <w:p>
@@ -11406,6 +11420,12 @@
         </w:rPr>
       </w:r>
     </w:p>
+    <w:p>
+      <w:r>
+        <w:br w:type="page"/>
+      </w:r>
+    </w:p>
+    <w:p/>
     <w:p/>
     <w:p>
       <w:pPr>
@@ -12349,12 +12369,18 @@
       </w:r>
     </w:p>
     <w:p>
+      <w:r>
+        <w:br w:type="page"/>
+      </w:r>
+    </w:p>
+    <w:p/>
+    <w:p/>
+    <w:p>
       <w:pPr>
         <w:keepNext w:val="1"/>
-        <w:spacing w:before="720" w:after="720" w:line="480" w:lineRule="auto"/>
+        <w:spacing w:before="240" w:after="240" w:line="240" w:lineRule="auto"/>
         <w:jc w:val="center"/>
         <w:rPr/>
-        <w:pageBreakBefore/>
       </w:pPr>
       <w:r>
         <w:rPr>
@@ -12377,6 +12403,9 @@
         </w:rPr>
       </w:r>
     </w:p>
+    <w:p/>
+    <w:p/>
+    <w:p/>
     <w:p>
       <w:pPr>
         <w:spacing w:before="40" w:after="20" w:line="264" w:lineRule="auto"/>
@@ -19839,9 +19868,12 @@
         </w:rPr>
       </w:r>
     </w:p>
-    <w:p>
-      <w:pPr>
-        <w:spacing w:before="720" w:after="720" w:line="480" w:lineRule="auto"/>
+    <w:p/>
+    <w:p/>
+    <w:p/>
+    <w:p>
+      <w:pPr>
+        <w:spacing w:before="120" w:after="0" w:line="456" w:lineRule="auto"/>
         <w:jc w:val="center"/>
         <w:rPr/>
       </w:pPr>
@@ -20691,10 +20723,13 @@
         </w:rPr>
       </w:r>
     </w:p>
+    <w:p/>
+    <w:p/>
+    <w:p/>
     <w:p>
       <w:pPr>
         <w:keepNext w:val="1"/>
-        <w:spacing w:before="720" w:after="720" w:line="480" w:lineRule="auto"/>
+        <w:spacing w:before="720" w:after="0" w:line="480" w:lineRule="auto"/>
         <w:jc w:val="center"/>
         <w:rPr/>
       </w:pPr>

</xml_diff>

<commit_message>
Draft_090: revert to commit e11411f (Figure 1 resize) — 114 pages
</commit_message>
<xml_diff>
--- a/thesis/003_ThesisProposal_Draft_090.docx
+++ b/thesis/003_ThesisProposal_Draft_090.docx
@@ -281,9 +281,6 @@
         <w:t xml:space="preserve">October 2026</w:t>
       </w:r>
     </w:p>
-    <w:p/>
-    <w:p/>
-    <w:p/>
     <w:p>
       <w:pPr>
         <w:spacing w:before="720" w:after="720" w:line="480" w:lineRule="auto"/>
@@ -2186,9 +2183,6 @@
         </w:rPr>
       </w:r>
     </w:p>
-    <w:p/>
-    <w:p/>
-    <w:p/>
     <w:p>
       <w:pPr>
         <w:spacing w:before="720" w:after="720" w:line="480" w:lineRule="auto"/>
@@ -4035,9 +4029,6 @@
         <w:t>Abstracts were accessed on-site at the PSAU Library with proper authorization. Student names were fully anonymized using discipline codes (Acs1–Acs10, Aas1–Aas10, VM1–VM20, B1–B20) before analysis began. Thesis titles that appear as quoted wording inside an abstract (source text) were redacted in the coded appendix where they identified the work. Residual title fragments, if any, do not include student names. The study analyzed linguistic patterns in text, not student performance or personal information. All data files were stored on password-protected devices and encrypted cloud storage accessible only to the researcher and thesis adviser. These files are retained for five years to support verification of coding decisions by future researchers and to allow for follow-up comparative studies, after which they are permanently deleted in line with standard academic data retention practice.</w:t>
       </w:r>
     </w:p>
-    <w:p/>
-    <w:p/>
-    <w:p/>
     <w:p>
       <w:pPr>
         <w:spacing w:before="720" w:after="720" w:line="480" w:lineRule="auto"/>
@@ -11140,12 +11131,27 @@
       </w:r>
     </w:p>
     <w:p>
+      <w:pPr>
+        <w:spacing w:before="0" w:after="0" w:line="480" w:lineRule="auto"/>
+        <w:ind w:firstLine="720"/>
+        <w:jc w:val="both"/>
+        <w:rPr/>
+      </w:pPr>
+      <w:r>
+        <w:rPr>
+          <w:rtl w:val="0"/>
+        </w:rPr>
+        <w:t/>
+      </w:r>
+    </w:p>
+    <w:p>
+      <w:pPr>
+        <w:spacing w:before="0" w:after="0" w:line="240" w:lineRule="auto"/>
+      </w:pPr>
       <w:r>
         <w:br w:type="page"/>
       </w:r>
     </w:p>
-    <w:p/>
-    <w:p/>
     <w:p>
       <w:pPr>
         <w:spacing w:before="720" w:after="720" w:line="480" w:lineRule="auto"/>
@@ -11421,12 +11427,13 @@
       </w:r>
     </w:p>
     <w:p>
+      <w:pPr>
+        <w:spacing w:before="0" w:after="0" w:line="240" w:lineRule="auto"/>
+      </w:pPr>
       <w:r>
         <w:br w:type="page"/>
       </w:r>
     </w:p>
-    <w:p/>
-    <w:p/>
     <w:p>
       <w:pPr>
         <w:spacing w:before="720" w:after="720" w:line="480" w:lineRule="auto"/>
@@ -12369,18 +12376,12 @@
       </w:r>
     </w:p>
     <w:p>
-      <w:r>
-        <w:br w:type="page"/>
-      </w:r>
-    </w:p>
-    <w:p/>
-    <w:p/>
-    <w:p>
       <w:pPr>
         <w:keepNext w:val="1"/>
         <w:spacing w:before="240" w:after="240" w:line="240" w:lineRule="auto"/>
         <w:jc w:val="center"/>
         <w:rPr/>
+        <w:pageBreakBefore w:val="1"/>
       </w:pPr>
       <w:r>
         <w:rPr>
@@ -12403,9 +12404,6 @@
         </w:rPr>
       </w:r>
     </w:p>
-    <w:p/>
-    <w:p/>
-    <w:p/>
     <w:p>
       <w:pPr>
         <w:spacing w:before="40" w:after="20" w:line="264" w:lineRule="auto"/>
@@ -19868,9 +19866,6 @@
         </w:rPr>
       </w:r>
     </w:p>
-    <w:p/>
-    <w:p/>
-    <w:p/>
     <w:p>
       <w:pPr>
         <w:spacing w:before="120" w:after="0" w:line="456" w:lineRule="auto"/>
@@ -20723,15 +20718,13 @@
         </w:rPr>
       </w:r>
     </w:p>
-    <w:p/>
-    <w:p/>
-    <w:p/>
     <w:p>
       <w:pPr>
         <w:keepNext w:val="1"/>
-        <w:spacing w:before="720" w:after="0" w:line="480" w:lineRule="auto"/>
+        <w:spacing w:before="240" w:after="0" w:line="480" w:lineRule="auto"/>
         <w:jc w:val="center"/>
         <w:rPr/>
+        <w:pageBreakBefore/>
       </w:pPr>
       <w:r>
         <w:rPr>

</xml_diff>

<commit_message>
Draft_090 (in place): convert CONCLUSIONS/REFERENCES/APPENDICES from pageBreakBefore to section breaks — now no page number on first page + 0.53" gap (matching INTRO/METHOD/RESULTS); 114 pages, 0 blank
</commit_message>
<xml_diff>
--- a/thesis/003_ThesisProposal_Draft_090.docx
+++ b/thesis/003_ThesisProposal_Draft_090.docx
@@ -11154,6 +11154,18 @@
     </w:p>
     <w:p>
       <w:pPr>
+        <w:sectPr>
+          <w:type w:val="nextPage"/>
+          <w:pgSz w:h="16838" w:w="11906" w:orient="portrait"/>
+          <w:pgMar w:bottom="1440" w:top="1440" w:left="2160" w:right="1440" w:header="720" w:footer="720"/>
+          <w:headerReference w:type="default" r:id="rId11"/>
+          <w:headerReference w:type="first" r:id="rId12"/>
+          <w:titlePg/>
+        </w:sectPr>
+      </w:pPr>
+    </w:p>
+    <w:p>
+      <w:pPr>
         <w:spacing w:before="720" w:after="720" w:line="480" w:lineRule="auto"/>
         <w:jc w:val="center"/>
         <w:rPr/>
@@ -11436,6 +11448,18 @@
     </w:p>
     <w:p>
       <w:pPr>
+        <w:sectPr>
+          <w:type w:val="nextPage"/>
+          <w:pgSz w:h="16838" w:w="11906" w:orient="portrait"/>
+          <w:pgMar w:bottom="1440" w:top="1440" w:left="2160" w:right="1440" w:header="720" w:footer="720"/>
+          <w:headerReference w:type="default" r:id="rId11"/>
+          <w:headerReference w:type="first" r:id="rId12"/>
+          <w:titlePg/>
+        </w:sectPr>
+      </w:pPr>
+    </w:p>
+    <w:p>
+      <w:pPr>
         <w:spacing w:before="720" w:after="720" w:line="480" w:lineRule="auto"/>
         <w:jc w:val="center"/>
         <w:rPr/>
@@ -12377,11 +12401,22 @@
     </w:p>
     <w:p>
       <w:pPr>
+        <w:sectPr>
+          <w:type w:val="nextPage"/>
+          <w:pgSz w:h="16838" w:w="11906" w:orient="portrait"/>
+          <w:pgMar w:bottom="1440" w:top="1440" w:left="2160" w:right="1440" w:header="720" w:footer="720"/>
+          <w:headerReference w:type="default" r:id="rId11"/>
+          <w:headerReference w:type="first" r:id="rId12"/>
+          <w:titlePg/>
+        </w:sectPr>
+      </w:pPr>
+    </w:p>
+    <w:p>
+      <w:pPr>
         <w:keepNext w:val="1"/>
         <w:spacing w:before="240" w:after="240" w:line="240" w:lineRule="auto"/>
         <w:jc w:val="center"/>
         <w:rPr/>
-        <w:pageBreakBefore w:val="1"/>
       </w:pPr>
       <w:r>
         <w:rPr>

</xml_diff>

<commit_message>
Draft_090 (in place): fix Appendix A overflow into Appendix B — add section break before APPENDIX B + fix spacing (before=720 after=720 line=480); 115 pages, 0 blank
</commit_message>
<xml_diff>
--- a/thesis/003_ThesisProposal_Draft_090.docx
+++ b/thesis/003_ThesisProposal_Draft_090.docx
@@ -19903,7 +19903,19 @@
     </w:p>
     <w:p>
       <w:pPr>
-        <w:spacing w:before="120" w:after="0" w:line="456" w:lineRule="auto"/>
+        <w:sectPr>
+          <w:type w:val="nextPage"/>
+          <w:pgSz w:h="16838" w:w="11906" w:orient="portrait"/>
+          <w:pgMar w:bottom="1440" w:top="1440" w:left="2160" w:right="1440" w:header="720" w:footer="720"/>
+          <w:headerReference w:type="default" r:id="rId11"/>
+          <w:headerReference w:type="first" r:id="rId12"/>
+          <w:titlePg/>
+        </w:sectPr>
+      </w:pPr>
+    </w:p>
+    <w:p>
+      <w:pPr>
+        <w:spacing w:before="720" w:after="720" w:line="480" w:lineRule="auto"/>
         <w:jc w:val="center"/>
         <w:rPr/>
       </w:pPr>

</xml_diff>

<commit_message>
Draft_090 (in place): fix Appendix A full codebook p56 spillover — reduce line spacing on 4 CODING SHEET COLUMNS bullets (1.5→single, after=8→0) so they fit on page 55; 114 pages, 0 blank
</commit_message>
<xml_diff>
--- a/thesis/003_ThesisProposal_Draft_090.docx
+++ b/thesis/003_ThesisProposal_Draft_090.docx
@@ -19790,7 +19790,7 @@
     </w:tbl>
     <w:p>
       <w:pPr>
-        <w:spacing w:before="0" w:after="8" w:line="360" w:lineRule="auto"/>
+        <w:spacing w:before="0" w:after="0" w:line="240" w:lineRule="auto"/>
         <w:ind w:firstLine="720"/>
         <w:jc w:val="both"/>
         <w:rPr/>
@@ -19818,7 +19818,7 @@
     </w:p>
     <w:p>
       <w:pPr>
-        <w:spacing w:before="0" w:after="8" w:line="360" w:lineRule="auto"/>
+        <w:spacing w:before="0" w:after="0" w:line="240" w:lineRule="auto"/>
         <w:ind w:firstLine="720"/>
         <w:jc w:val="both"/>
         <w:rPr/>
@@ -19847,7 +19847,7 @@
     </w:p>
     <w:p>
       <w:pPr>
-        <w:spacing w:before="0" w:after="8" w:line="360" w:lineRule="auto"/>
+        <w:spacing w:before="0" w:after="0" w:line="240" w:lineRule="auto"/>
         <w:ind w:firstLine="720"/>
         <w:jc w:val="both"/>
         <w:rPr/>
@@ -19876,7 +19876,7 @@
     </w:p>
     <w:p>
       <w:pPr>
-        <w:spacing w:before="0" w:after="8" w:line="360" w:lineRule="auto"/>
+        <w:spacing w:before="0" w:after="0" w:line="240" w:lineRule="auto"/>
         <w:jc w:val="left"/>
         <w:rPr/>
       </w:pPr>

</xml_diff>

<commit_message>
Draft_090 (in place): revert APPENDIX B to D89 handling — LEFT-aligned, original spacing, no section break; bullets flow naturally before heading (matches D89 subtle approach)
</commit_message>
<xml_diff>
--- a/thesis/003_ThesisProposal_Draft_090.docx
+++ b/thesis/003_ThesisProposal_Draft_090.docx
@@ -19790,7 +19790,7 @@
     </w:tbl>
     <w:p>
       <w:pPr>
-        <w:spacing w:before="0" w:after="0" w:line="240" w:lineRule="auto"/>
+        <w:spacing w:before="0" w:after="8" w:line="360" w:lineRule="auto"/>
         <w:ind w:firstLine="720"/>
         <w:jc w:val="both"/>
         <w:rPr/>
@@ -19818,7 +19818,7 @@
     </w:p>
     <w:p>
       <w:pPr>
-        <w:spacing w:before="0" w:after="0" w:line="240" w:lineRule="auto"/>
+        <w:spacing w:before="0" w:after="8" w:line="360" w:lineRule="auto"/>
         <w:ind w:firstLine="720"/>
         <w:jc w:val="both"/>
         <w:rPr/>
@@ -19847,7 +19847,7 @@
     </w:p>
     <w:p>
       <w:pPr>
-        <w:spacing w:before="0" w:after="0" w:line="240" w:lineRule="auto"/>
+        <w:spacing w:before="0" w:after="8" w:line="360" w:lineRule="auto"/>
         <w:ind w:firstLine="720"/>
         <w:jc w:val="both"/>
         <w:rPr/>
@@ -19903,20 +19903,8 @@
     </w:p>
     <w:p>
       <w:pPr>
-        <w:sectPr>
-          <w:type w:val="nextPage"/>
-          <w:pgSz w:h="16838" w:w="11906" w:orient="portrait"/>
-          <w:pgMar w:bottom="1440" w:top="1440" w:left="2160" w:right="1440" w:header="720" w:footer="720"/>
-          <w:headerReference w:type="default" r:id="rId11"/>
-          <w:headerReference w:type="first" r:id="rId12"/>
-          <w:titlePg/>
-        </w:sectPr>
-      </w:pPr>
-    </w:p>
-    <w:p>
-      <w:pPr>
-        <w:spacing w:before="720" w:after="720" w:line="480" w:lineRule="auto"/>
-        <w:jc w:val="center"/>
+        <w:spacing w:before="120" w:after="0" w:line="456" w:lineRule="auto"/>
+        <w:jc w:val="left"/>
         <w:rPr/>
       </w:pPr>
       <w:r>

</xml_diff>

<commit_message>
Draft_090 (in place): revert Appendix A Full Codebook to match D89 exactly — APPENDIX A heading back to 11pt LEFT (was 14pt CENTER), UNHEDGED ASSERTIONS back to JUSTIFY (was LEFT); Appendix A section now identical to D89
</commit_message>
<xml_diff>
--- a/thesis/003_ThesisProposal_Draft_090.docx
+++ b/thesis/003_ThesisProposal_Draft_090.docx
@@ -12442,13 +12442,13 @@
     <w:p>
       <w:pPr>
         <w:spacing w:before="40" w:after="20" w:line="264" w:lineRule="auto"/>
-        <w:jc w:val="center"/>
+        <w:jc w:val="left"/>
         <w:rPr/>
       </w:pPr>
       <w:r>
         <w:rPr>
           <w:rFonts w:ascii="Georgia" w:cs="Georgia" w:eastAsia="Georgia" w:hAnsi="Georgia"/>
-          <w:sz w:val="28"/>
+          <w:sz w:val="22"/>
           <w:szCs w:val="22"/>
           <w:rtl w:val="0"/>
           <w:b/>
@@ -17691,7 +17691,7 @@
     <w:p>
       <w:pPr>
         <w:spacing w:before="40" w:after="14" w:line="360" w:lineRule="auto"/>
-        <w:jc w:val="left"/>
+        <w:jc w:val="both"/>
         <w:rPr/>
       </w:pPr>
       <w:r>

</xml_diff>

<commit_message>
Draft_090 (in place): restore alignment from exchange 39 (APPENDIX A CENTER, UNHEDGED ASSERTIONS LEFT) — only font size and line spacing follow D89, alignment untouched
</commit_message>
<xml_diff>
--- a/thesis/003_ThesisProposal_Draft_090.docx
+++ b/thesis/003_ThesisProposal_Draft_090.docx
@@ -12442,7 +12442,7 @@
     <w:p>
       <w:pPr>
         <w:spacing w:before="40" w:after="20" w:line="264" w:lineRule="auto"/>
-        <w:jc w:val="left"/>
+        <w:jc w:val="center"/>
         <w:rPr/>
       </w:pPr>
       <w:r>
@@ -17691,7 +17691,7 @@
     <w:p>
       <w:pPr>
         <w:spacing w:before="40" w:after="14" w:line="360" w:lineRule="auto"/>
-        <w:jc w:val="both"/>
+        <w:jc w:val="left"/>
         <w:rPr/>
       </w:pPr>
       <w:r>

</xml_diff>

<commit_message>
Draft_090 (in place): copy ALL Appendix A formatting from D89 (pPr + rPr for all 59 paragraphs) — font sizes, line spacing, before/after, alignment now 1:1 match with D89
</commit_message>
<xml_diff>
--- a/thesis/003_ThesisProposal_Draft_090.docx
+++ b/thesis/003_ThesisProposal_Draft_090.docx
@@ -12442,7 +12442,7 @@
     <w:p>
       <w:pPr>
         <w:spacing w:before="40" w:after="20" w:line="264" w:lineRule="auto"/>
-        <w:jc w:val="center"/>
+        <w:jc w:val="left"/>
         <w:rPr/>
       </w:pPr>
       <w:r>
@@ -17691,7 +17691,7 @@
     <w:p>
       <w:pPr>
         <w:spacing w:before="40" w:after="14" w:line="360" w:lineRule="auto"/>
-        <w:jc w:val="left"/>
+        <w:jc w:val="both"/>
         <w:rPr/>
       </w:pPr>
       <w:r>

</xml_diff>

<commit_message>
Draft_090 (in place): remove section breaks I added before CONCLUSIONS/REFERENCES/APPENDICES — D90 now matches D89 structure exactly (5 sections, 427 paragraphs); spillover was caused by section structure changes affecting pagination
</commit_message>
<xml_diff>
--- a/thesis/003_ThesisProposal_Draft_090.docx
+++ b/thesis/003_ThesisProposal_Draft_090.docx
@@ -11154,18 +11154,6 @@
     </w:p>
     <w:p>
       <w:pPr>
-        <w:sectPr>
-          <w:type w:val="nextPage"/>
-          <w:pgSz w:h="16838" w:w="11906" w:orient="portrait"/>
-          <w:pgMar w:bottom="1440" w:top="1440" w:left="2160" w:right="1440" w:header="720" w:footer="720"/>
-          <w:headerReference w:type="default" r:id="rId11"/>
-          <w:headerReference w:type="first" r:id="rId12"/>
-          <w:titlePg/>
-        </w:sectPr>
-      </w:pPr>
-    </w:p>
-    <w:p>
-      <w:pPr>
         <w:spacing w:before="720" w:after="720" w:line="480" w:lineRule="auto"/>
         <w:jc w:val="center"/>
         <w:rPr/>
@@ -11448,18 +11436,6 @@
     </w:p>
     <w:p>
       <w:pPr>
-        <w:sectPr>
-          <w:type w:val="nextPage"/>
-          <w:pgSz w:h="16838" w:w="11906" w:orient="portrait"/>
-          <w:pgMar w:bottom="1440" w:top="1440" w:left="2160" w:right="1440" w:header="720" w:footer="720"/>
-          <w:headerReference w:type="default" r:id="rId11"/>
-          <w:headerReference w:type="first" r:id="rId12"/>
-          <w:titlePg/>
-        </w:sectPr>
-      </w:pPr>
-    </w:p>
-    <w:p>
-      <w:pPr>
         <w:spacing w:before="720" w:after="720" w:line="480" w:lineRule="auto"/>
         <w:jc w:val="center"/>
         <w:rPr/>
@@ -12401,22 +12377,11 @@
     </w:p>
     <w:p>
       <w:pPr>
-        <w:sectPr>
-          <w:type w:val="nextPage"/>
-          <w:pgSz w:h="16838" w:w="11906" w:orient="portrait"/>
-          <w:pgMar w:bottom="1440" w:top="1440" w:left="2160" w:right="1440" w:header="720" w:footer="720"/>
-          <w:headerReference w:type="default" r:id="rId11"/>
-          <w:headerReference w:type="first" r:id="rId12"/>
-          <w:titlePg/>
-        </w:sectPr>
-      </w:pPr>
-    </w:p>
-    <w:p>
-      <w:pPr>
         <w:keepNext w:val="1"/>
         <w:spacing w:before="240" w:after="240" w:line="240" w:lineRule="auto"/>
         <w:jc w:val="center"/>
         <w:rPr/>
+        <w:pageBreakBefore/>
       </w:pPr>
       <w:r>
         <w:rPr>

</xml_diff>

<commit_message>
Draft_090 (in place): re-add section breaks before CONCLUSIONS and REFERENCES only (NOT APPENDICES — that caused Appendix A spillover); APPENDICES keeps pageBreakBefore (matching D89)
</commit_message>
<xml_diff>
--- a/thesis/003_ThesisProposal_Draft_090.docx
+++ b/thesis/003_ThesisProposal_Draft_090.docx
@@ -11154,6 +11154,18 @@
     </w:p>
     <w:p>
       <w:pPr>
+        <w:sectPr>
+          <w:type w:val="nextPage"/>
+          <w:pgSz w:h="16838" w:w="11906" w:orient="portrait"/>
+          <w:pgMar w:bottom="1440" w:top="1440" w:left="2160" w:right="1440" w:header="720" w:footer="720"/>
+          <w:headerReference w:type="default" r:id="rId11"/>
+          <w:headerReference w:type="first" r:id="rId12"/>
+          <w:titlePg/>
+        </w:sectPr>
+      </w:pPr>
+    </w:p>
+    <w:p>
+      <w:pPr>
         <w:spacing w:before="720" w:after="720" w:line="480" w:lineRule="auto"/>
         <w:jc w:val="center"/>
         <w:rPr/>
@@ -11433,6 +11445,18 @@
       <w:r>
         <w:br w:type="page"/>
       </w:r>
+    </w:p>
+    <w:p>
+      <w:pPr>
+        <w:sectPr>
+          <w:type w:val="nextPage"/>
+          <w:pgSz w:h="16838" w:w="11906" w:orient="portrait"/>
+          <w:pgMar w:bottom="1440" w:top="1440" w:left="2160" w:right="1440" w:header="720" w:footer="720"/>
+          <w:headerReference w:type="default" r:id="rId11"/>
+          <w:headerReference w:type="first" r:id="rId12"/>
+          <w:titlePg/>
+        </w:sectPr>
+      </w:pPr>
     </w:p>
     <w:p>
       <w:pPr>

</xml_diff>

<commit_message>
Draft_090 (in place): remove ALL section breaks I added — D90 now structurally identical to D89 (5 sections, 427 paragraphs)
</commit_message>
<xml_diff>
--- a/thesis/003_ThesisProposal_Draft_090.docx
+++ b/thesis/003_ThesisProposal_Draft_090.docx
@@ -11154,18 +11154,6 @@
     </w:p>
     <w:p>
       <w:pPr>
-        <w:sectPr>
-          <w:type w:val="nextPage"/>
-          <w:pgSz w:h="16838" w:w="11906" w:orient="portrait"/>
-          <w:pgMar w:bottom="1440" w:top="1440" w:left="2160" w:right="1440" w:header="720" w:footer="720"/>
-          <w:headerReference w:type="default" r:id="rId11"/>
-          <w:headerReference w:type="first" r:id="rId12"/>
-          <w:titlePg/>
-        </w:sectPr>
-      </w:pPr>
-    </w:p>
-    <w:p>
-      <w:pPr>
         <w:spacing w:before="720" w:after="720" w:line="480" w:lineRule="auto"/>
         <w:jc w:val="center"/>
         <w:rPr/>
@@ -11445,18 +11433,6 @@
       <w:r>
         <w:br w:type="page"/>
       </w:r>
-    </w:p>
-    <w:p>
-      <w:pPr>
-        <w:sectPr>
-          <w:type w:val="nextPage"/>
-          <w:pgSz w:h="16838" w:w="11906" w:orient="portrait"/>
-          <w:pgMar w:bottom="1440" w:top="1440" w:left="2160" w:right="1440" w:header="720" w:footer="720"/>
-          <w:headerReference w:type="default" r:id="rId11"/>
-          <w:headerReference w:type="first" r:id="rId12"/>
-          <w:titlePg/>
-        </w:sectPr>
-      </w:pPr>
     </w:p>
     <w:p>
       <w:pPr>

</xml_diff>

<commit_message>
Draft_090: revert to D89 base + only Mohammed italics fix — no other changes; 115 pages matching D89 pagination
</commit_message>
<xml_diff>
--- a/thesis/003_ThesisProposal_Draft_090.docx
+++ b/thesis/003_ThesisProposal_Draft_090.docx
@@ -1144,12 +1144,11 @@
       <w:pPr>
         <w:spacing w:before="120" w:after="240" w:line="480" w:lineRule="auto"/>
         <w:jc w:val="center"/>
-        <w:keepNext/>
       </w:pPr>
       <w:r>
         <w:drawing>
           <wp:inline>
-            <wp:extent cx="3520440" cy="2787015"/>
+            <wp:extent cx="5029200" cy="3981450"/>
             <wp:docPr id="1" name="Picture 1"/>
             <wp:cNvGraphicFramePr>
               <a:graphicFrameLocks noChangeAspect="1"/>
@@ -2436,7 +2435,7 @@
           <w:rFonts w:ascii="Georgia" w:hAnsi="Georgia" w:cs="Georgia" w:eastAsia="Georgia"/>
           <w:i w:val="0"/>
           <w:iCs w:val="0"/>
-          <w:sz w:val="22"/>
+          <w:sz w:val="24"/>
           <w:szCs w:val="24"/>
           <w:rtl w:val="0"/>
           <w:b w:val="0"/>
@@ -10297,7 +10296,7 @@
         <w:rPr>
           <w:rFonts w:ascii="Georgia" w:hAnsi="Georgia" w:cs="Georgia" w:eastAsia="Georgia"/>
           <w:b w:val="0"/>
-          <w:sz w:val="22"/>
+          <w:sz w:val="24"/>
           <w:szCs w:val="24"/>
         </w:rPr>
         <w:t xml:space="preserve">Outcome Type by Discipline</w:t>
@@ -12381,7 +12380,7 @@
         <w:spacing w:before="240" w:after="240" w:line="240" w:lineRule="auto"/>
         <w:jc w:val="center"/>
         <w:rPr/>
-        <w:pageBreakBefore/>
+        <w:pageBreakBefore w:val="1"/>
       </w:pPr>
       <w:r>
         <w:rPr>
@@ -20233,17 +20232,17 @@
           <w:bCs w:val="0"/>
           <w:i w:val="0"/>
           <w:iCs w:val="0"/>
-          <w:sz w:val="22"/>
-          <w:szCs w:val="24"/>
-          <w:rtl w:val="0"/>
-        </w:rPr>
-        <w:t xml:space="preserve">“The results suggested that...” (Lexical Verb - Epistemic Caution)</w:t>
-      </w:r>
-      <w:r>
-        <w:rPr>
-          <w:rtl w:val="0"/>
           <w:sz w:val="24"/>
           <w:szCs w:val="24"/>
+          <w:rtl w:val="0"/>
+        </w:rPr>
+        <w:t xml:space="preserve">“The results suggested that...” (Lexical Verb - Epistemic Caution)</w:t>
+      </w:r>
+      <w:r>
+        <w:rPr>
+          <w:rtl w:val="0"/>
+          <w:sz w:val="24"/>
+          <w:szCs w:val="24"/>
         </w:rPr>
       </w:r>
     </w:p>
@@ -20260,7 +20259,7 @@
           <w:bCs w:val="0"/>
           <w:i w:val="0"/>
           <w:iCs w:val="0"/>
-          <w:sz w:val="22"/>
+          <w:sz w:val="24"/>
           <w:szCs w:val="24"/>
           <w:rtl w:val="0"/>
         </w:rPr>
@@ -20722,7 +20721,7 @@
       <w:pPr>
         <w:keepNext w:val="1"/>
         <w:spacing w:before="240" w:after="0" w:line="480" w:lineRule="auto"/>
-        <w:jc w:val="center"/>
+        <w:jc w:val="left"/>
         <w:rPr/>
         <w:pageBreakBefore/>
       </w:pPr>

</xml_diff>